<commit_message>
Protocolmanuscript (bijgehouden wijzigingen ter goedkeuring): 25% per sessie tot drie aanpassingen, Usual Care drukmeting alleen baseline en maand 6 geblindeerd, MoveMonitor alleen bij de start
Co-Authored-By: Claude Opus 5.5 <noreply@anthropic.com>
</commit_message>
<xml_diff>
--- a/protocol paper/integrating_offloading__adherence_monitoring_and_behaviour_change_to_prevent_diabetic_foot_ulcer_recurrence__protocol_for_the_paradise_multicentre_randomised_controlled_trial.docx
+++ b/protocol paper/integrating_offloading__adherence_monitoring_and_behaviour_change_to_prevent_diabetic_foot_ulcer_recurrence__protocol_for_the_paradise_multicentre_randomised_controlled_trial.docx
@@ -3116,7 +3116,57 @@
           <w:color w:val="000000"/>
           <w:lang w:val="en-GB"/>
         </w:rPr>
-        <w:t>Pressure-guided footwear optimisation. Each participant receives a new pair of custom-made foot orthoses manufactured by a certified pedorthist. Construction follows the type of shoe in which the orthosis is worn: in fully custom-made footwear a 5 mm micro-cork base carries a 5 mm total-contact ethylene-vinyl acetate layer, whereas in extra-depth off-the-shelf footwear a 6 mm ethylene-vinyl acetate layer is used without a cork base. Both are completed with a 3–5 mm medial arch support, a 9–10 mm transmetatarsal bar positioned 6–11 mm proximal to the metatarsal heads, local depth relief at fragile or prominent regions, and a full-length top cover of 3 mm closed-cell foam over 3 mm open-cell cushioning foam . The clinical team measures in-shoe plantar pressures using the Novel Pedar in-shoe system (Novel GmbH, Munich, Germany) with the Novel database software, during repeated ambulation along a 10-metre walkway, acquiring a minimum of 12 mid-gait steps per foot. Sensor insoles are calibrated and zeroed before use. Peak pressure is reported per foot region using a standardised eight-region mask (heel, medial and lateral midfoot, metatarsals 1, 2–3 and 4–5, hallux, and lesser toes). Up to three target regions are designated per foot: the site of the previous ulcer, together with the two forefoot or midfoot regions showing the highest peak pressure above 200 kPa (fewer when fewer regions exceed that threshold); the heel is not eligible as a target region. The orthosis is considered adequately offloading when, at each target region, peak pressure with the orthosis is below 200 kPa or is at least 25% lower than at the same region measured without the orthosis at delivery (visit 2). That measurement remains the reference at 6, 12 and 18 months: the condition without the orthosis is repeated at every assessment to document the current unprotected pressure, but it does not replace the reference. At follow-up the orthosis is also modified when peak pressure at a target region has risen by 5% or more since the previous measurement, even if it remains below the threshold. In parallel, the study team conducts a validation sub-study using the F-Scan GO in-shoe system (Tekscan, Norwood, MA, USA) with FootVIEW Pro software, comparing the two systems; F-Scan GO measurements are performed by the study team only and do not inform clinical decision-making or influence the primary endpoint. Baseline measurement is performed at self-selected comfortable walking speed, which is thereafter maintained within 5% at follow-up to preserve comparability; standardised thin seamless cotton socks are worn throughout. Following the design protocol of Bus and colleagues  and the optimisation criteria validated in that group’s earlier work , orthosis geometry is iteratively modified under in-shoe peak-pressure feedback until in-shoe peak plantar pressure falls below 200 kPa at all previously ulcerated and high-risk regions, or is reduced by at least 25% from the participant's own baseline, whichever is achieved first. Achieved pressure reduction is recorded for every participant and reported as a fidelity measure, so that a null clinical result can be interpreted against the offloading actually delivered rather than the offloading intended.</w:t>
+        <w:t xml:space="preserve">Pressure-guided footwear optimisation. Each participant receives a new pair of custom-made foot orthoses manufactured by a certified pedorthist. Construction follows the type of shoe in which the orthosis is worn: in fully custom-made footwear a 5 mm micro-cork base carries a 5 mm total-contact ethylene-vinyl acetate layer, whereas in extra-depth off-the-shelf footwear a 6 mm ethylene-vinyl acetate layer is used without a cork base. Both are completed with a 3–5 mm medial arch support, a 9–10 mm transmetatarsal bar positioned 6–11 mm proximal to the metatarsal heads, local depth relief at fragile or prominent regions, and a full-length top cover of 3 mm closed-cell foam over 3 mm open-cell cushioning foam . The clinical team measures in-shoe plantar pressures using the Novel Pedar in-shoe system (Novel GmbH, Munich, Germany) with the Novel database software, during repeated ambulation along a 10-metre walkway, acquiring a minimum of 12 mid-gait steps per foot. Sensor insoles are calibrated and zeroed before use. Peak pressure is reported per foot region using a standardised eight-region mask (heel, medial and lateral midfoot, metatarsals 1, 2–3 and 4–5, hallux, and lesser toes). Up to three target regions are designated per foot: the site of the previous ulcer, together with the two forefoot or midfoot regions showing the highest peak pressure above 200 kPa (fewer when fewer regions exceed that threshold); the heel is not eligible as a target region. The orthosis is considered adequately offloading when, at each target region, peak pressure with the orthosis is below 200 kPa or is at least 25% lower than at the same region </w:t>
+      </w:r>
+      <w:del w:id="90000" w:author="Claude" w:date="2026-10-08T17:38:15Z">
+        <w:r>
+          <w:rPr>
+            <w:color w:val="000000"/>
+            <w:lang w:val="en-GB"/>
+          </w:rPr>
+          <w:delText xml:space="preserve">measured without the orthosis at delivery (visit 2). That measurement remains the reference at 6, 12 and 18 months: the condition without the orthosis is repeated at every assessment to document the current unprotected pressure, but it does not replace the reference.</w:delText>
+        </w:r>
+      </w:del>
+      <w:ins w:id="90001" w:author="Claude" w:date="2026-10-08T17:38:15Z">
+        <w:r>
+          <w:rPr>
+            <w:color w:val="000000"/>
+            <w:lang w:val="en-GB"/>
+          </w:rPr>
+          <w:t xml:space="preserve">measured without the orthosis in the same session; the condition without the orthosis is therefore repeated at every assessment, immediately before the measurement with the orthosis.</w:t>
+        </w:r>
+      </w:ins>
+      <w:r>
+        <w:rPr>
+          <w:color w:val="000000"/>
+          <w:lang w:val="en-GB"/>
+        </w:rPr>
+        <w:t xml:space="preserve"> At follow-up the orthosis is also modified when peak pressure at a target region has risen by 5% or more since the previous measurement, even if it remains below the threshold. In parallel, the study team conducts a validation sub-study using the F-Scan GO in-shoe system (Tekscan, Norwood, MA, USA) with FootVIEW Pro software, comparing the two systems; F-Scan GO measurements are performed by the study team only and do not inform clinical decision-making or influence the primary endpoint. Baseline measurement is performed at self-selected comfortable walking speed, which is thereafter maintained within 5% at follow-up to preserve comparability; standardised thin seamless cotton socks are worn throughout. Following the design protocol of Bus and colleagues  and the optimisation criteria validated in that group’s earlier work , orthosis geometry is iteratively modified under in-shoe peak-pressure feedback until in-shoe peak plantar pressure falls below 200 kPa at all previously ulcerated and high-risk regions, </w:t>
+      </w:r>
+      <w:del w:id="90002" w:author="Claude" w:date="2026-10-08T17:38:15Z">
+        <w:r>
+          <w:rPr>
+            <w:color w:val="000000"/>
+            <w:lang w:val="en-GB"/>
+          </w:rPr>
+          <w:delText xml:space="preserve">or is reduced by at least 25% from the participant's own baseline, whichever is achieved first.</w:delText>
+        </w:r>
+      </w:del>
+      <w:ins w:id="90003" w:author="Claude" w:date="2026-10-08T17:38:15Z">
+        <w:r>
+          <w:rPr>
+            <w:color w:val="000000"/>
+            <w:lang w:val="en-GB"/>
+          </w:rPr>
+          <w:t xml:space="preserve">or is reduced by at least 25% relative to the measurement without the orthosis in the same session, whichever is achieved first, with up to three modification rounds per session.</w:t>
+        </w:r>
+      </w:ins>
+      <w:r>
+        <w:rPr>
+          <w:color w:val="000000"/>
+          <w:lang w:val="en-GB"/>
+        </w:rPr>
+        <w:t xml:space="preserve"> Achieved pressure reduction is recorded for every participant and reported as a fidelity measure, so that a null clinical result can be interpreted against the offloading actually delivered rather than the offloading intended.</w:t>
       </w:r>
       <w:sdt>
         <w:sdtPr>
@@ -3469,7 +3519,38 @@
           <w:color w:val="000000"/>
           <w:lang w:val="en-GB"/>
         </w:rPr>
-        <w:t>Tailoring and fidelity. Both components are individually tailored: the offloading target is defined against that participant's own pressure measured without the orthosis at delivery (visit 2), and SEBIA content from Step 3 onward is adapted to each participant's specific adherence barriers rather than delivered as a fixed script. No criteria for modifying intervention intensity for individual participants are pre-specified; intervention delivery continues as scheduled unless a participant withdraws, develops an ulcer requiring active treatment, or meets a discontinuation criterion. Fidelity is supported structurally through standardised motivational interviewing training and is monitored empirically through the process evaluation using structured observation, protocol-deviation logs and therapist diaries, so that delivery fidelity is measured rather than assumed.</w:t>
+        <w:t xml:space="preserve">Tailoring and fidelity. Both components are individually tailored: the offloading target is defined against that participant's own pressure </w:t>
+      </w:r>
+      <w:del w:id="90004" w:author="Claude" w:date="2026-10-08T17:38:15Z">
+        <w:r>
+          <w:rPr>
+            <w:b/>
+            <w:bCs/>
+            <w:color w:val="000000"/>
+            <w:lang w:val="en-GB"/>
+          </w:rPr>
+          <w:delText xml:space="preserve">measured without the orthosis at delivery (visit 2)</w:delText>
+        </w:r>
+      </w:del>
+      <w:ins w:id="90005" w:author="Claude" w:date="2026-10-08T17:38:15Z">
+        <w:r>
+          <w:rPr>
+            <w:b/>
+            <w:bCs/>
+            <w:color w:val="000000"/>
+            <w:lang w:val="en-GB"/>
+          </w:rPr>
+          <w:t xml:space="preserve">measured without the orthosis in the same session</w:t>
+        </w:r>
+      </w:ins>
+      <w:r>
+        <w:rPr>
+          <w:b/>
+          <w:bCs/>
+          <w:color w:val="000000"/>
+          <w:lang w:val="en-GB"/>
+        </w:rPr>
+        <w:t xml:space="preserve">, and SEBIA content from Step 3 onward is adapted to each participant's specific adherence barriers rather than delivered as a fixed script. No criteria for modifying intervention intensity for individual participants are pre-specified; intervention delivery continues as scheduled unless a participant withdraws, develops an ulcer requiring active treatment, or meets a discontinuation criterion. Fidelity is supported structurally through standardised motivational interviewing training and is monitored empirically through the process evaluation using structured observation, protocol-deviation logs and therapist diaries, so that delivery fidelity is measured rather than assumed.</w:t>
       </w:r>
       <w:r>
         <w:rPr>
@@ -3872,7 +3953,32 @@
           <w:color w:val="000000"/>
           <w:lang w:val="en-GB"/>
         </w:rPr>
-        <w:t xml:space="preserve"> Plantar-surface ulcer recurrence; recurrent ulceration at predefined personalised high-risk locations referenced against baseline pressure mapping; ulcer-free survival days; duration of custom-made footwear use; in-shoe peak plantar pressure at baseline, six, twelve and eighteen months; footwear wear-and-tear scored on the validated scale for therapeutic footwear </w:t>
+        <w:t xml:space="preserve"> Plantar-surface ulcer recurrence; recurrent ulceration at predefined personalised high-risk locations referenced against baseline pressure mapping; ulcer-free survival days; duration of custom-made footwear use; </w:t>
+      </w:r>
+      <w:del w:id="90006" w:author="Claude" w:date="2026-10-08T17:38:15Z">
+        <w:r>
+          <w:rPr>
+            <w:color w:val="000000"/>
+            <w:lang w:val="en-GB"/>
+          </w:rPr>
+          <w:delText xml:space="preserve">in-shoe peak plantar pressure at baseline, six, twelve and eighteen months</w:delText>
+        </w:r>
+      </w:del>
+      <w:ins w:id="90007" w:author="Claude" w:date="2026-10-08T17:38:15Z">
+        <w:r>
+          <w:rPr>
+            <w:color w:val="000000"/>
+            <w:lang w:val="en-GB"/>
+          </w:rPr>
+          <w:t xml:space="preserve">in-shoe peak plantar pressure at baseline and six months in both arms, and at twelve and eighteen months in the intervention arm</w:t>
+        </w:r>
+      </w:ins>
+      <w:r>
+        <w:rPr>
+          <w:color w:val="000000"/>
+          <w:lang w:val="en-GB"/>
+        </w:rPr>
+        <w:t xml:space="preserve">; footwear wear-and-tear scored on the validated scale for therapeutic footwear </w:t>
       </w:r>
       <w:sdt>
         <w:sdtPr>
@@ -3981,7 +4087,57 @@
           <w:color w:val="000000"/>
           <w:lang w:val="en-GB"/>
         </w:rPr>
-        <w:t>Cumulative plantar tissue stress is derived for each participant as the integral over follow-up of region-specific plantar pressure and weight-bearing activity, partitioned by whether prescribed footwear was worn, combining serial in-shoe pressure measurement with the Novel pedar system, MoveMonitor activity profiling sampled at baseline and six months only, and continuous Orthotimer wear-time recording. Because in-shoe pressure is measured at four timepoints and activity is sampled at only two timepoints, while wear time is recorded continuously, pressure and activity values are carried forward between measurements; this approximation is stated explicitly and its influence examined by restricting analysis to the intervals immediately surrounding each pressure or activity measurement.</w:t>
+        <w:t xml:space="preserve">Cumulative plantar tissue stress is derived for each participant as the integral over follow-up of region-specific plantar pressure and weight-bearing activity, partitioned by whether prescribed footwear was worn, combining serial in-shoe pressure measurement with the Novel pedar system, </w:t>
+      </w:r>
+      <w:del w:id="90008" w:author="Claude" w:date="2026-10-08T17:38:15Z">
+        <w:r>
+          <w:rPr>
+            <w:color w:val="000000"/>
+            <w:lang w:val="en-GB"/>
+          </w:rPr>
+          <w:delText xml:space="preserve">MoveMonitor activity profiling sampled at baseline and six months only</w:delText>
+        </w:r>
+      </w:del>
+      <w:ins w:id="90009" w:author="Claude" w:date="2026-10-08T17:38:15Z">
+        <w:r>
+          <w:rPr>
+            <w:color w:val="000000"/>
+            <w:lang w:val="en-GB"/>
+          </w:rPr>
+          <w:t xml:space="preserve">MoveMonitor activity profiling sampled at baseline only</w:t>
+        </w:r>
+      </w:ins>
+      <w:r>
+        <w:rPr>
+          <w:color w:val="000000"/>
+          <w:lang w:val="en-GB"/>
+        </w:rPr>
+        <w:t xml:space="preserve">, and continuous Orthotimer wear-time recording. Because in-shoe pressure is </w:t>
+      </w:r>
+      <w:del w:id="90010" w:author="Claude" w:date="2026-10-08T17:38:15Z">
+        <w:r>
+          <w:rPr>
+            <w:color w:val="000000"/>
+            <w:lang w:val="en-GB"/>
+          </w:rPr>
+          <w:delText xml:space="preserve">measured at four timepoints and activity is sampled at only two timepoints</w:delText>
+        </w:r>
+      </w:del>
+      <w:ins w:id="90011" w:author="Claude" w:date="2026-10-08T17:38:15Z">
+        <w:r>
+          <w:rPr>
+            <w:color w:val="000000"/>
+            <w:lang w:val="en-GB"/>
+          </w:rPr>
+          <w:t xml:space="preserve">measured at up to four timepoints (two in the usual-care arm) and activity is sampled only at baseline</w:t>
+        </w:r>
+      </w:ins>
+      <w:r>
+        <w:rPr>
+          <w:color w:val="000000"/>
+          <w:lang w:val="en-GB"/>
+        </w:rPr>
+        <w:t xml:space="preserve">, while wear time is recorded continuously, pressure and activity values are carried forward between measurements; this approximation is stated explicitly and its influence examined by restricting analysis to the intervals immediately surrounding each pressure or activity measurement.</w:t>
       </w:r>
     </w:p>
     <w:p>
@@ -4079,7 +4235,32 @@
           <w:color w:val="000000"/>
           <w:lang w:val="en-GB"/>
         </w:rPr>
-        <w:t xml:space="preserve">Third, outcome data for the clinical, health-economic and process evaluations are collected by two research assessors who take no part in intervention delivery. In-shoe pressure measurement is performed in both arms, but the resulting values are not shown to or discussed with usual-care participants. This warrants explicit justification, since elevated plantar pressure is a clinically meaningful risk marker </w:t>
+        <w:t xml:space="preserve">Third, outcome data for the clinical, health-economic and process evaluations are collected by two research assessors who take no part in intervention delivery. </w:t>
+      </w:r>
+      <w:del w:id="90012" w:author="Claude" w:date="2026-10-08T17:38:15Z">
+        <w:r>
+          <w:rPr>
+            <w:color w:val="000000"/>
+            <w:lang w:val="en-GB"/>
+          </w:rPr>
+          <w:delText xml:space="preserve">In-shoe pressure measurement is performed in both arms, but the resulting values</w:delText>
+        </w:r>
+      </w:del>
+      <w:ins w:id="90013" w:author="Claude" w:date="2026-10-08T17:38:15Z">
+        <w:r>
+          <w:rPr>
+            <w:color w:val="000000"/>
+            <w:lang w:val="en-GB"/>
+          </w:rPr>
+          <w:t xml:space="preserve">In-shoe pressure measurement is performed in both arms, in the usual-care arm only at baseline and six months, with a 50 kPa display threshold and the values switched off, so that the resulting values</w:t>
+        </w:r>
+      </w:ins>
+      <w:r>
+        <w:rPr>
+          <w:color w:val="000000"/>
+          <w:lang w:val="en-GB"/>
+        </w:rPr>
+        <w:t xml:space="preserve"> are not shown to or discussed with usual-care participants. This warrants explicit justification, since elevated plantar pressure is a clinically meaningful risk marker </w:t>
       </w:r>
       <w:sdt>
         <w:sdtPr>
@@ -10438,6 +10619,14 @@
               </w:rPr>
               <w:t>Plantar pressure measurement (Novel pedar)</w:t>
             </w:r>
+            <w:ins w:id="90014" w:author="Claude" w:date="2026-10-08T17:38:15Z">
+              <w:r>
+                <w:rPr>
+                  <w:color w:val="000000"/>
+                </w:rPr>
+                <w:t xml:space="preserve">; usual care only at baseline and 6 months, blinded</w:t>
+              </w:r>
+            </w:ins>
           </w:p>
         </w:tc>
         <w:tc>
@@ -11346,12 +11535,14 @@
             <w:tcW w:w="0" w:type="auto"/>
           </w:tcPr>
           <w:p>
-            <w:r>
-              <w:rPr>
-                <w:color w:val="000000"/>
-              </w:rPr>
-              <w:t>X</w:t>
-            </w:r>
+            <w:del w:id="90015" w:author="Claude" w:date="2026-10-08T17:38:15Z">
+              <w:r>
+                <w:rPr>
+                  <w:color w:val="000000"/>
+                </w:rPr>
+                <w:delText xml:space="preserve">X</w:delText>
+              </w:r>
+            </w:del>
           </w:p>
         </w:tc>
         <w:tc>
@@ -13462,8 +13653,26 @@
                 <w:color w:val="000000"/>
                 <w:lang w:val="en-GB"/>
               </w:rPr>
-              <w:t>Delivery of the manufactured orthosis; integration of the Orthotimer adherence sensor; iterative pressure-guided adjustment to &lt;200 kPa or ≥25% reduction from baseline.</w:t>
-            </w:r>
+              <w:t xml:space="preserve">Delivery of the manufactured orthosis; integration of the Orthotimer adherence sensor; iterative pressure-guided adjustment to &lt;200 kPa or </w:t>
+            </w:r>
+            <w:del w:id="90016" w:author="Claude" w:date="2026-10-08T17:38:15Z">
+              <w:r>
+                <w:rPr>
+                  <w:color w:val="000000"/>
+                  <w:lang w:val="en-GB"/>
+                </w:rPr>
+                <w:delText xml:space="preserve">≥25% reduction from baseline.</w:delText>
+              </w:r>
+            </w:del>
+            <w:ins w:id="90017" w:author="Claude" w:date="2026-10-08T17:38:15Z">
+              <w:r>
+                <w:rPr>
+                  <w:color w:val="000000"/>
+                  <w:lang w:val="en-GB"/>
+                </w:rPr>
+                <w:t xml:space="preserve">≥25% reduction relative to the same session without the orthosis, up to three modifications.</w:t>
+              </w:r>
+            </w:ins>
           </w:p>
         </w:tc>
         <w:tc>

</xml_diff>

<commit_message>
Protocol en manuscript (bijgehouden wijzigingen): CMFO-onderlaag micro-cork of EVA shore 50; confectie- en semi-orthopedisch schoeisel zonder kurk
Info van de PI via het deck voor de voetklinieken van 12 oktober 2026; de zin over de confectieschoen
was dubbelzinnig (beslissing 6 oktober 2026). Toegevoegd naast de openstaande wijzigingen, met unieke w:id's.

Co-Authored-By: Claude Opus 5.5 <noreply@anthropic.com>
</commit_message>
<xml_diff>
--- a/protocol paper/integrating_offloading__adherence_monitoring_and_behaviour_change_to_prevent_diabetic_foot_ulcer_recurrence__protocol_for_the_paradise_multicentre_randomised_controlled_trial.docx
+++ b/protocol paper/integrating_offloading__adherence_monitoring_and_behaviour_change_to_prevent_diabetic_foot_ulcer_recurrence__protocol_for_the_paradise_multicentre_randomised_controlled_trial.docx
@@ -3116,7 +3116,57 @@
           <w:color w:val="000000"/>
           <w:lang w:val="en-GB"/>
         </w:rPr>
-        <w:t xml:space="preserve">Pressure-guided footwear optimisation. Each participant receives a new pair of custom-made foot orthoses manufactured by a certified pedorthist. Construction follows the type of shoe in which the orthosis is worn: in fully custom-made footwear a 5 mm micro-cork base carries a 5 mm total-contact ethylene-vinyl acetate layer, whereas in extra-depth off-the-shelf footwear a 6 mm ethylene-vinyl acetate layer is used without a cork base. Both are completed with a 3–5 mm medial arch support, a 9–10 mm transmetatarsal bar positioned 6–11 mm proximal to the metatarsal heads, local depth relief at fragile or prominent regions, and a full-length top cover of 3 mm closed-cell foam over 3 mm open-cell cushioning foam . The clinical team measures in-shoe plantar pressures using the Novel Pedar in-shoe system (Novel GmbH, Munich, Germany) with the Novel database software, during repeated ambulation along a 10-metre walkway, acquiring a minimum of 12 mid-gait steps per foot. Sensor insoles are calibrated and zeroed before use. Peak pressure is reported per foot region using a standardised eight-region mask (heel, medial and lateral midfoot, metatarsals 1, 2–3 and 4–5, hallux, and lesser toes). Up to three target regions are designated per foot: the site of the previous ulcer, together with the two forefoot or midfoot regions showing the highest peak pressure above 200 kPa (fewer when fewer regions exceed that threshold); the heel is not eligible as a target region. The orthosis is considered adequately offloading when, at each target region, peak pressure with the orthosis is below 200 kPa or is at least 25% lower than at the same region </w:t>
+        <w:t xml:space="preserve">Pressure-guided footwear optimisation. Each participant receives a new pair of custom-made foot orthoses manufactured by a certified pedorthist. Construction follows the type of shoe in which the orthosis is worn: in fully custom-made footwear </w:t>
+      </w:r>
+      <w:del w:id="90018" w:author="Claude" w:date="2026-10-12T16:03:41Z">
+        <w:r>
+          <w:rPr>
+            <w:color w:val="000000"/>
+            <w:lang w:val="en-GB"/>
+          </w:rPr>
+          <w:delText xml:space="preserve">a 5 mm micro-cork base</w:delText>
+        </w:r>
+      </w:del>
+      <w:ins w:id="90019" w:author="Claude" w:date="2026-10-12T16:03:41Z">
+        <w:r>
+          <w:rPr>
+            <w:color w:val="000000"/>
+            <w:lang w:val="en-GB"/>
+          </w:rPr>
+          <w:t xml:space="preserve">a 5 mm base of micro-cork or shore-50 ethylene-vinyl acetate</w:t>
+        </w:r>
+      </w:ins>
+      <w:r>
+        <w:rPr>
+          <w:color w:val="000000"/>
+          <w:lang w:val="en-GB"/>
+        </w:rPr>
+        <w:t xml:space="preserve"> carries a 5 mm total-contact ethylene-vinyl acetate layer, whereas </w:t>
+      </w:r>
+      <w:del w:id="90020" w:author="Claude" w:date="2026-10-12T16:03:41Z">
+        <w:r>
+          <w:rPr>
+            <w:color w:val="000000"/>
+            <w:lang w:val="en-GB"/>
+          </w:rPr>
+          <w:delText xml:space="preserve">in extra-depth off-the-shelf footwear</w:delText>
+        </w:r>
+      </w:del>
+      <w:ins w:id="90021" w:author="Claude" w:date="2026-10-12T16:03:41Z">
+        <w:r>
+          <w:rPr>
+            <w:color w:val="000000"/>
+            <w:lang w:val="en-GB"/>
+          </w:rPr>
+          <w:t xml:space="preserve">in extra-depth off-the-shelf or semi-orthopaedic footwear</w:t>
+        </w:r>
+      </w:ins>
+      <w:r>
+        <w:rPr>
+          <w:color w:val="000000"/>
+          <w:lang w:val="en-GB"/>
+        </w:rPr>
+        <w:t xml:space="preserve"> a 6 mm ethylene-vinyl acetate layer is used without a cork base. Both are completed with a 3–5 mm medial arch support, a 9–10 mm transmetatarsal bar positioned 6–11 mm proximal to the metatarsal heads, local depth relief at fragile or prominent regions, and a full-length top cover of 3 mm closed-cell foam over 3 mm open-cell cushioning foam . The clinical team measures in-shoe plantar pressures using the Novel Pedar in-shoe system (Novel GmbH, Munich, Germany) with the Novel database software, during repeated ambulation along a 10-metre walkway, acquiring a minimum of 12 mid-gait steps per foot. Sensor insoles are calibrated and zeroed before use. Peak pressure is reported per foot region using a standardised eight-region mask (heel, medial and lateral midfoot, metatarsals 1, 2–3 and 4–5, hallux, and lesser toes). Up to three target regions are designated per foot: the site of the previous ulcer, together with the two forefoot or midfoot regions showing the highest peak pressure above 200 kPa (fewer when fewer regions exceed that threshold); the heel is not eligible as a target region. The orthosis is considered adequately offloading when, at each target region, peak pressure with the orthosis is below 200 kPa or is at least 25% lower than at the same region </w:t>
       </w:r>
       <w:del w:id="90000" w:author="Claude" w:date="2026-10-08T17:38:15Z">
         <w:r>
@@ -13587,7 +13637,57 @@
                 <w:color w:val="000000"/>
                 <w:lang w:val="en-GB"/>
               </w:rPr>
-              <w:t>Prescription of a custom-made foot orthosis. In fully custom-made footwear: 5 mm micro-cork base with a 5 mm total-contact EVA layer; in extra-depth off-the-shelf footwear: 6 mm EVA without cork. Both with a 3–5 mm medial arch support; a 9–10 mm transmetatarsal bar 6–11 mm proximal to the metatarsal heads; local depth relief; full-length layered closed-cell over open-cell foam top cover.</w:t>
+              <w:t xml:space="preserve">Prescription of a custom-made foot orthosis. In fully custom-made footwear: </w:t>
+            </w:r>
+            <w:del w:id="90022" w:author="Claude" w:date="2026-10-12T16:03:41Z">
+              <w:r>
+                <w:rPr>
+                  <w:color w:val="000000"/>
+                  <w:lang w:val="en-GB"/>
+                </w:rPr>
+                <w:delText xml:space="preserve">5 mm micro-cork base</w:delText>
+              </w:r>
+            </w:del>
+            <w:ins w:id="90023" w:author="Claude" w:date="2026-10-12T16:03:41Z">
+              <w:r>
+                <w:rPr>
+                  <w:color w:val="000000"/>
+                  <w:lang w:val="en-GB"/>
+                </w:rPr>
+                <w:t xml:space="preserve">5 mm micro-cork or EVA (shore 50) base</w:t>
+              </w:r>
+            </w:ins>
+            <w:r>
+              <w:rPr>
+                <w:color w:val="000000"/>
+                <w:lang w:val="en-GB"/>
+              </w:rPr>
+              <w:t xml:space="preserve"> with a 5 mm total-contact EVA layer; </w:t>
+            </w:r>
+            <w:del w:id="90024" w:author="Claude" w:date="2026-10-12T16:03:41Z">
+              <w:r>
+                <w:rPr>
+                  <w:color w:val="000000"/>
+                  <w:lang w:val="en-GB"/>
+                </w:rPr>
+                <w:delText xml:space="preserve">in extra-depth off-the-shelf footwear</w:delText>
+              </w:r>
+            </w:del>
+            <w:ins w:id="90025" w:author="Claude" w:date="2026-10-12T16:03:41Z">
+              <w:r>
+                <w:rPr>
+                  <w:color w:val="000000"/>
+                  <w:lang w:val="en-GB"/>
+                </w:rPr>
+                <w:t xml:space="preserve">in extra-depth off-the-shelf or semi-orthopaedic footwear</w:t>
+              </w:r>
+            </w:ins>
+            <w:r>
+              <w:rPr>
+                <w:color w:val="000000"/>
+                <w:lang w:val="en-GB"/>
+              </w:rPr>
+              <w:t xml:space="preserve">: 6 mm EVA without cork. Both with a 3–5 mm medial arch support; a 9–10 mm transmetatarsal bar 6–11 mm proximal to the metatarsal heads; local depth relief; full-length layered closed-cell over open-cell foam top cover.</w:t>
             </w:r>
           </w:p>
         </w:tc>

</xml_diff>

<commit_message>
Protocolmanuscript: NAFF op visite 1 en opnieuw op visite 2 (FWO-dossier), als gedrag in plaats van kennis (bijgehouden wijzigingen)
Co-Authored-By: Claude Opus 5.5 <noreply@anthropic.com>
</commit_message>
<xml_diff>
--- a/protocol paper/integrating_offloading__adherence_monitoring_and_behaviour_change_to_prevent_diabetic_foot_ulcer_recurrence__protocol_for_the_paradise_multicentre_randomised_controlled_trial.docx
+++ b/protocol paper/integrating_offloading__adherence_monitoring_and_behaviour_change_to_prevent_diabetic_foot_ulcer_recurrence__protocol_for_the_paradise_multicentre_randomised_controlled_trial.docx
@@ -3887,7 +3887,32 @@
           <w:color w:val="000000"/>
           <w:lang w:val="en-GB"/>
         </w:rPr>
-        <w:t xml:space="preserve">, assesses health literacy, and delivers tailored education comprising written materials, demonstration of foot-care procedures and supervised practice. Step 2, at the second visit two weeks to one month after baseline and coinciding with orthosis delivery and sensor integration, retests foot-care knowledge using the teach-back method, reinforces content where recall is incomplete, delivers education on wearing protective footwear indoors as well as outdoors — the setting in which adherence is lowest and most steps are taken </w:t>
+        <w:t xml:space="preserve">, assesses health literacy, and delivers tailored education comprising written materials, demonstration of foot-care procedures and supervised practice. Step 2, at the second visit two weeks to one month after baseline and coinciding with orthosis delivery and sensor integration, </w:t>
+      </w:r>
+      <w:del w:id="90452" w:author="Claude" w:date="2026-10-19T12:00:00Z">
+        <w:r>
+          <w:rPr>
+            <w:color w:val="000000"/>
+            <w:lang w:val="en-GB"/>
+          </w:rPr>
+          <w:delText xml:space="preserve">retests foot-care knowledge using the teach-back method</w:delText>
+        </w:r>
+      </w:del>
+      <w:ins w:id="90453" w:author="Claude" w:date="2026-10-19T12:00:00Z">
+        <w:r>
+          <w:rPr>
+            <w:color w:val="000000"/>
+            <w:lang w:val="en-GB"/>
+          </w:rPr>
+          <w:t xml:space="preserve">repeats the Nottingham Assessment of Functional Footcare, checks recall of the education using the teach-back method</w:t>
+        </w:r>
+      </w:ins>
+      <w:r>
+        <w:rPr>
+          <w:color w:val="000000"/>
+          <w:lang w:val="en-GB"/>
+        </w:rPr>
+        <w:t xml:space="preserve">, reinforces content where recall is incomplete, delivers education on wearing protective footwear indoors as well as outdoors — the setting in which adherence is lowest and most steps are taken </w:t>
       </w:r>
       <w:sdt>
         <w:sdtPr>
@@ -4696,7 +4721,32 @@
           <w:color w:val="000000"/>
           <w:lang w:val="en-GB"/>
         </w:rPr>
-        <w:t>; foot self-care knowledge (Nottingham Assessment of Functional Footcare) at baseline, three, nine and fifteen months; self-reported footwear adherence on a visual analogue scale, collected in parallel with sensor data to quantify self-</w:t>
+        <w:t xml:space="preserve">; </w:t>
+      </w:r>
+      <w:del w:id="90454" w:author="Claude" w:date="2026-10-19T12:00:00Z">
+        <w:r>
+          <w:rPr>
+            <w:color w:val="000000"/>
+            <w:lang w:val="en-GB"/>
+          </w:rPr>
+          <w:delText xml:space="preserve">foot self-care knowledge (Nottingham Assessment of Functional Footcare) at baseline, three, nine and fifteen months</w:delText>
+        </w:r>
+      </w:del>
+      <w:ins w:id="90455" w:author="Claude" w:date="2026-10-19T12:00:00Z">
+        <w:r>
+          <w:rPr>
+            <w:color w:val="000000"/>
+            <w:lang w:val="en-GB"/>
+          </w:rPr>
+          <w:t xml:space="preserve">foot self-care behaviour (Nottingham Assessment of Functional Footcare) at baseline, repeated at the second visit in the intervention arm</w:t>
+        </w:r>
+      </w:ins>
+      <w:r>
+        <w:rPr>
+          <w:color w:val="000000"/>
+          <w:lang w:val="en-GB"/>
+        </w:rPr>
+        <w:t xml:space="preserve">; self-reported footwear adherence on a visual analogue scale, collected in parallel with sensor data to quantify self-</w:t>
       </w:r>
       <w:r>
         <w:rPr>
@@ -12825,35 +12875,46 @@
                 <w:lang w:val="en-GB"/>
               </w:rPr>
             </w:pPr>
+            <w:del w:id="90456" w:author="Claude" w:date="2026-10-19T12:00:00Z">
+              <w:r>
+                <w:rPr>
+                  <w:color w:val="000000"/>
+                  <w:lang w:val="en-GB"/>
+                </w:rPr>
+                <w:delText>Foot-care knowledge (NAFF) / health literacy</w:delText>
+              </w:r>
+            </w:del>
+            <w:ins w:id="90457" w:author="Claude" w:date="2026-10-19T12:00:00Z">
+              <w:r>
+                <w:rPr>
+                  <w:color w:val="000000"/>
+                  <w:lang w:val="en-GB"/>
+                </w:rPr>
+                <w:t xml:space="preserve">Foot-care behaviour (NAFF) / health literacy; NAFF repeated at V2 in PARADISE</w:t>
+              </w:r>
+            </w:ins>
+          </w:p>
+        </w:tc>
+        <w:tc>
+          <w:tcPr>
+            <w:tcW w:w="0" w:type="auto"/>
+          </w:tcPr>
+          <w:p>
+            <w:pPr>
+              <w:rPr>
+                <w:lang w:val="en-GB"/>
+              </w:rPr>
+            </w:pPr>
+          </w:p>
+        </w:tc>
+        <w:tc>
+          <w:tcPr>
+            <w:tcW w:w="0" w:type="auto"/>
+          </w:tcPr>
+          <w:p>
             <w:r>
               <w:rPr>
                 <w:color w:val="000000"/>
-                <w:lang w:val="en-GB"/>
-              </w:rPr>
-              <w:t>Foot-care knowledge (NAFF) / health literacy</w:t>
-            </w:r>
-          </w:p>
-        </w:tc>
-        <w:tc>
-          <w:tcPr>
-            <w:tcW w:w="0" w:type="auto"/>
-          </w:tcPr>
-          <w:p>
-            <w:pPr>
-              <w:rPr>
-                <w:lang w:val="en-GB"/>
-              </w:rPr>
-            </w:pPr>
-          </w:p>
-        </w:tc>
-        <w:tc>
-          <w:tcPr>
-            <w:tcW w:w="0" w:type="auto"/>
-          </w:tcPr>
-          <w:p>
-            <w:r>
-              <w:rPr>
-                <w:color w:val="000000"/>
               </w:rPr>
               <w:t>X</w:t>
             </w:r>
@@ -12863,6 +12924,36 @@
           <w:tcPr>
             <w:tcW w:w="0" w:type="auto"/>
           </w:tcPr>
+          <w:p>
+            <w:ins w:id="90461" w:author="Claude" w:date="2026-10-19T12:00:00Z">
+              <w:r>
+                <w:rPr>
+                  <w:color w:val="000000"/>
+                </w:rPr>
+                <w:t xml:space="preserve">X</w:t>
+              </w:r>
+            </w:ins>
+          </w:p>
+        </w:tc>
+        <w:tc>
+          <w:tcPr>
+            <w:tcW w:w="0" w:type="auto"/>
+          </w:tcPr>
+          <w:p>
+            <w:del w:id="90458" w:author="Claude" w:date="2026-10-19T12:00:00Z">
+              <w:r>
+                <w:rPr>
+                  <w:color w:val="000000"/>
+                </w:rPr>
+                <w:delText>X</w:delText>
+              </w:r>
+            </w:del>
+          </w:p>
+        </w:tc>
+        <w:tc>
+          <w:tcPr>
+            <w:tcW w:w="0" w:type="auto"/>
+          </w:tcPr>
           <w:p/>
         </w:tc>
         <w:tc>
@@ -12870,12 +12961,14 @@
             <w:tcW w:w="0" w:type="auto"/>
           </w:tcPr>
           <w:p>
-            <w:r>
-              <w:rPr>
-                <w:color w:val="000000"/>
-              </w:rPr>
-              <w:t>X</w:t>
-            </w:r>
+            <w:del w:id="90459" w:author="Claude" w:date="2026-10-19T12:00:00Z">
+              <w:r>
+                <w:rPr>
+                  <w:color w:val="000000"/>
+                </w:rPr>
+                <w:delText>X</w:delText>
+              </w:r>
+            </w:del>
           </w:p>
         </w:tc>
         <w:tc>
@@ -12889,31 +12982,14 @@
             <w:tcW w:w="0" w:type="auto"/>
           </w:tcPr>
           <w:p>
-            <w:r>
-              <w:rPr>
-                <w:color w:val="000000"/>
-              </w:rPr>
-              <w:t>X</w:t>
-            </w:r>
-          </w:p>
-        </w:tc>
-        <w:tc>
-          <w:tcPr>
-            <w:tcW w:w="0" w:type="auto"/>
-          </w:tcPr>
-          <w:p/>
-        </w:tc>
-        <w:tc>
-          <w:tcPr>
-            <w:tcW w:w="0" w:type="auto"/>
-          </w:tcPr>
-          <w:p>
-            <w:r>
-              <w:rPr>
-                <w:color w:val="000000"/>
-              </w:rPr>
-              <w:t>X</w:t>
-            </w:r>
+            <w:del w:id="90460" w:author="Claude" w:date="2026-10-19T12:00:00Z">
+              <w:r>
+                <w:rPr>
+                  <w:color w:val="000000"/>
+                </w:rPr>
+                <w:delText>X</w:delText>
+              </w:r>
+            </w:del>
           </w:p>
         </w:tc>
         <w:tc>
@@ -14960,12 +15036,22 @@
             <w:tcW w:w="0" w:type="auto"/>
           </w:tcPr>
           <w:p>
-            <w:r>
-              <w:rPr>
-                <w:color w:val="000000"/>
-              </w:rPr>
-              <w:t>Foot self-care knowledge</w:t>
-            </w:r>
+            <w:del w:id="90462" w:author="Claude" w:date="2026-10-19T12:00:00Z">
+              <w:r>
+                <w:rPr>
+                  <w:color w:val="000000"/>
+                </w:rPr>
+                <w:delText>Foot self-care knowledge</w:delText>
+              </w:r>
+            </w:del>
+            <w:ins w:id="90463" w:author="Claude" w:date="2026-10-19T12:00:00Z">
+              <w:r>
+                <w:rPr>
+                  <w:color w:val="000000"/>
+                </w:rPr>
+                <w:t xml:space="preserve">Foot self-care behaviour</w:t>
+              </w:r>
+            </w:ins>
           </w:p>
         </w:tc>
         <w:tc>
@@ -14978,13 +15064,24 @@
                 <w:lang w:val="en-GB"/>
               </w:rPr>
             </w:pPr>
-            <w:r>
-              <w:rPr>
-                <w:color w:val="000000"/>
-                <w:lang w:val="en-GB"/>
-              </w:rPr>
-              <w:t>Knowledge of diabetic foot self-care.</w:t>
-            </w:r>
+            <w:del w:id="90464" w:author="Claude" w:date="2026-10-19T12:00:00Z">
+              <w:r>
+                <w:rPr>
+                  <w:color w:val="000000"/>
+                  <w:lang w:val="en-GB"/>
+                </w:rPr>
+                <w:delText>Knowledge of diabetic foot self-care.</w:delText>
+              </w:r>
+            </w:del>
+            <w:ins w:id="90465" w:author="Claude" w:date="2026-10-19T12:00:00Z">
+              <w:r>
+                <w:rPr>
+                  <w:color w:val="000000"/>
+                  <w:lang w:val="en-GB"/>
+                </w:rPr>
+                <w:t xml:space="preserve">Self-reported protective foot-care behaviour.</w:t>
+              </w:r>
+            </w:ins>
           </w:p>
         </w:tc>
         <w:tc>
@@ -15043,12 +15140,22 @@
             <w:tcW w:w="0" w:type="auto"/>
           </w:tcPr>
           <w:p>
-            <w:r>
-              <w:rPr>
-                <w:color w:val="000000"/>
-              </w:rPr>
-              <w:t>Baseline, 3, 9 and 15 months</w:t>
-            </w:r>
+            <w:del w:id="90466" w:author="Claude" w:date="2026-10-19T12:00:00Z">
+              <w:r>
+                <w:rPr>
+                  <w:color w:val="000000"/>
+                </w:rPr>
+                <w:delText>Baseline, 3, 9 and 15 months</w:delText>
+              </w:r>
+            </w:del>
+            <w:ins w:id="90467" w:author="Claude" w:date="2026-10-19T12:00:00Z">
+              <w:r>
+                <w:rPr>
+                  <w:color w:val="000000"/>
+                </w:rPr>
+                <w:t xml:space="preserve">Baseline; visit 2 in PARADISE (SEBIA step 2)</w:t>
+              </w:r>
+            </w:ins>
           </w:p>
         </w:tc>
       </w:tr>
@@ -16032,12 +16139,30 @@
             <w:tcW w:w="0" w:type="auto"/>
           </w:tcPr>
           <w:p>
+            <w:del w:id="90468" w:author="Claude" w:date="2026-10-19T12:00:00Z">
+              <w:r>
+                <w:rPr>
+                  <w:color w:val="000000"/>
+                  <w:lang w:val="en-GB"/>
+                </w:rPr>
+                <w:delText xml:space="preserve">Foot-care knowledge (NAFF)</w:delText>
+              </w:r>
+            </w:del>
+            <w:ins w:id="90469" w:author="Claude" w:date="2026-10-19T12:00:00Z">
+              <w:r>
+                <w:rPr>
+                  <w:color w:val="000000"/>
+                  <w:lang w:val="en-GB"/>
+                </w:rPr>
+                <w:t xml:space="preserve">Foot-care behaviour (NAFF)</w:t>
+              </w:r>
+            </w:ins>
             <w:r>
               <w:rPr>
                 <w:color w:val="000000"/>
                 <w:lang w:val="en-GB"/>
               </w:rPr>
-              <w:t xml:space="preserve">Foot-care knowledge (NAFF) and health-literacy assessment; tailored education with written materials, demonstration and supervised practice. </w:t>
+              <w:t xml:space="preserve"> and health-literacy assessment; tailored education with written materials, demonstration and supervised practice. </w:t>
             </w:r>
             <w:r>
               <w:rPr>
@@ -16099,12 +16224,30 @@
             <w:tcW w:w="0" w:type="auto"/>
           </w:tcPr>
           <w:p>
+            <w:del w:id="90470" w:author="Claude" w:date="2026-10-19T12:00:00Z">
+              <w:r>
+                <w:rPr>
+                  <w:color w:val="000000"/>
+                  <w:lang w:val="en-GB"/>
+                </w:rPr>
+                <w:delText xml:space="preserve">Knowledge retest by teach-back</w:delText>
+              </w:r>
+            </w:del>
+            <w:ins w:id="90471" w:author="Claude" w:date="2026-10-19T12:00:00Z">
+              <w:r>
+                <w:rPr>
+                  <w:color w:val="000000"/>
+                  <w:lang w:val="en-GB"/>
+                </w:rPr>
+                <w:t xml:space="preserve">NAFF repeated; recall checked by teach-back</w:t>
+              </w:r>
+            </w:ins>
             <w:r>
               <w:rPr>
                 <w:color w:val="000000"/>
                 <w:lang w:val="en-GB"/>
               </w:rPr>
-              <w:t xml:space="preserve">Knowledge retest by teach-back; education on indoor and outdoor footwear use; introduction of sensor-based wear-time monitoring. </w:t>
+              <w:t xml:space="preserve">; education on indoor and outdoor footwear use; introduction of sensor-based wear-time monitoring. </w:t>
             </w:r>
             <w:r>
               <w:rPr>

</xml_diff>